<commit_message>
Actualizar contenido de la web
</commit_message>
<xml_diff>
--- a/0.Instrucciones.docx
+++ b/0.Instrucciones.docx
@@ -1492,6 +1492,1858 @@
         <w:pStyle w:val="Sinespaciado"/>
         <w:jc w:val="both"/>
         <w:rPr>
+          <w:b/>
+          <w:bCs/>
+          <w:u w:val="single"/>
+          <w:lang w:val="es-ES_tradnl"/>
+        </w:rPr>
+      </w:pPr>
+      <w:r>
+        <w:rPr>
+          <w:b/>
+          <w:bCs/>
+          <w:u w:val="single"/>
+          <w:lang w:val="es-ES_tradnl"/>
+        </w:rPr>
+        <w:t xml:space="preserve">Flujo básico con </w:t>
+      </w:r>
+      <w:proofErr w:type="spellStart"/>
+      <w:r>
+        <w:rPr>
+          <w:b/>
+          <w:bCs/>
+          <w:u w:val="single"/>
+          <w:lang w:val="es-ES_tradnl"/>
+        </w:rPr>
+        <w:t>Quarto</w:t>
+      </w:r>
+      <w:proofErr w:type="spellEnd"/>
+      <w:r>
+        <w:rPr>
+          <w:b/>
+          <w:bCs/>
+          <w:u w:val="single"/>
+          <w:lang w:val="es-ES_tradnl"/>
+        </w:rPr>
+        <w:t xml:space="preserve"> y GitHub Pages</w:t>
+      </w:r>
+    </w:p>
+    <w:p>
+      <w:pPr>
+        <w:pStyle w:val="Sinespaciado"/>
+        <w:jc w:val="both"/>
+        <w:rPr>
+          <w:lang w:val="es-ES_tradnl"/>
+        </w:rPr>
+      </w:pPr>
+    </w:p>
+    <w:p>
+      <w:pPr>
+        <w:pStyle w:val="Sinespaciado"/>
+        <w:numPr>
+          <w:ilvl w:val="0"/>
+          <w:numId w:val="2"/>
+        </w:numPr>
+        <w:jc w:val="both"/>
+        <w:rPr>
+          <w:lang w:val="es-ES_tradnl"/>
+        </w:rPr>
+      </w:pPr>
+      <w:r>
+        <w:rPr>
+          <w:lang w:val="es-ES_tradnl"/>
+        </w:rPr>
+        <w:t>En la carpeta del proyecto, renderizar la web:</w:t>
+      </w:r>
+    </w:p>
+    <w:p>
+      <w:pPr>
+        <w:pStyle w:val="Sinespaciado"/>
+        <w:jc w:val="both"/>
+        <w:rPr>
+          <w:lang w:val="es-ES_tradnl"/>
+        </w:rPr>
+      </w:pPr>
+    </w:p>
+    <w:p>
+      <w:pPr>
+        <w:pStyle w:val="Sinespaciado"/>
+        <w:jc w:val="both"/>
+        <w:rPr>
+          <w:lang w:val="es-ES_tradnl"/>
+        </w:rPr>
+      </w:pPr>
+      <w:r>
+        <w:rPr>
+          <w:lang w:val="es-ES_tradnl"/>
+        </w:rPr>
+        <w:drawing>
+          <wp:inline distT="0" distB="0" distL="0" distR="0" wp14:anchorId="02BC548F" wp14:editId="28D6359A">
+            <wp:extent cx="5396230" cy="1471295"/>
+            <wp:effectExtent l="0" t="0" r="1270" b="1905"/>
+            <wp:docPr id="790944614" name="Imagen 1" descr="Texto, Carta&#10;&#10;El contenido generado por IA puede ser incorrecto."/>
+            <wp:cNvGraphicFramePr>
+              <a:graphicFrameLocks xmlns:a="http://schemas.openxmlformats.org/drawingml/2006/main" noChangeAspect="1"/>
+            </wp:cNvGraphicFramePr>
+            <a:graphic xmlns:a="http://schemas.openxmlformats.org/drawingml/2006/main">
+              <a:graphicData uri="http://schemas.openxmlformats.org/drawingml/2006/picture">
+                <pic:pic xmlns:pic="http://schemas.openxmlformats.org/drawingml/2006/picture">
+                  <pic:nvPicPr>
+                    <pic:cNvPr id="790944614" name="Imagen 1" descr="Texto, Carta&#10;&#10;El contenido generado por IA puede ser incorrecto."/>
+                    <pic:cNvPicPr/>
+                  </pic:nvPicPr>
+                  <pic:blipFill>
+                    <a:blip r:embed="rId11"/>
+                    <a:stretch>
+                      <a:fillRect/>
+                    </a:stretch>
+                  </pic:blipFill>
+                  <pic:spPr>
+                    <a:xfrm>
+                      <a:off x="0" y="0"/>
+                      <a:ext cx="5396230" cy="1471295"/>
+                    </a:xfrm>
+                    <a:prstGeom prst="rect">
+                      <a:avLst/>
+                    </a:prstGeom>
+                  </pic:spPr>
+                </pic:pic>
+              </a:graphicData>
+            </a:graphic>
+          </wp:inline>
+        </w:drawing>
+      </w:r>
+    </w:p>
+    <w:p>
+      <w:pPr>
+        <w:pStyle w:val="Sinespaciado"/>
+        <w:jc w:val="both"/>
+        <w:rPr>
+          <w:lang w:val="es-ES_tradnl"/>
+        </w:rPr>
+      </w:pPr>
+    </w:p>
+    <w:p>
+      <w:pPr>
+        <w:pStyle w:val="Sinespaciado"/>
+        <w:numPr>
+          <w:ilvl w:val="1"/>
+          <w:numId w:val="2"/>
+        </w:numPr>
+        <w:jc w:val="both"/>
+        <w:rPr>
+          <w:lang w:val="es-ES_tradnl"/>
+        </w:rPr>
+      </w:pPr>
+      <w:r>
+        <w:rPr>
+          <w:lang w:val="es-ES_tradnl"/>
+        </w:rPr>
+        <w:t xml:space="preserve">Esto genera el sitio estático en </w:t>
+      </w:r>
+      <w:proofErr w:type="spellStart"/>
+      <w:r>
+        <w:rPr>
+          <w:lang w:val="es-ES_tradnl"/>
+        </w:rPr>
+        <w:t>docs</w:t>
+      </w:r>
+      <w:proofErr w:type="spellEnd"/>
+      <w:r>
+        <w:rPr>
+          <w:lang w:val="es-ES_tradnl"/>
+        </w:rPr>
+        <w:t>/</w:t>
+      </w:r>
+    </w:p>
+    <w:p>
+      <w:pPr>
+        <w:pStyle w:val="Sinespaciado"/>
+        <w:jc w:val="both"/>
+        <w:rPr>
+          <w:lang w:val="es-ES_tradnl"/>
+        </w:rPr>
+      </w:pPr>
+    </w:p>
+    <w:p>
+      <w:pPr>
+        <w:pStyle w:val="Sinespaciado"/>
+        <w:numPr>
+          <w:ilvl w:val="0"/>
+          <w:numId w:val="2"/>
+        </w:numPr>
+        <w:jc w:val="both"/>
+        <w:rPr>
+          <w:lang w:val="es-ES_tradnl"/>
+        </w:rPr>
+      </w:pPr>
+      <w:r>
+        <w:rPr>
+          <w:lang w:val="es-ES_tradnl"/>
+        </w:rPr>
+        <w:t xml:space="preserve">Inicializar Git, hacer </w:t>
+      </w:r>
+      <w:proofErr w:type="spellStart"/>
+      <w:r>
+        <w:rPr>
+          <w:lang w:val="es-ES_tradnl"/>
+        </w:rPr>
+        <w:t>commit</w:t>
+      </w:r>
+      <w:proofErr w:type="spellEnd"/>
+      <w:r>
+        <w:rPr>
+          <w:lang w:val="es-ES_tradnl"/>
+        </w:rPr>
+        <w:t xml:space="preserve"> y conectar con el repo:</w:t>
+      </w:r>
+    </w:p>
+    <w:p>
+      <w:pPr>
+        <w:pStyle w:val="Sinespaciado"/>
+        <w:numPr>
+          <w:ilvl w:val="1"/>
+          <w:numId w:val="2"/>
+        </w:numPr>
+        <w:jc w:val="both"/>
+        <w:rPr>
+          <w:lang w:val="es-ES_tradnl"/>
+        </w:rPr>
+      </w:pPr>
+      <w:r>
+        <w:rPr>
+          <w:lang w:val="es-ES_tradnl"/>
+        </w:rPr>
+        <w:lastRenderedPageBreak/>
+        <w:t xml:space="preserve">Lo primero es inicializar Git con </w:t>
+      </w:r>
+      <w:proofErr w:type="spellStart"/>
+      <w:r>
+        <w:rPr>
+          <w:lang w:val="es-ES_tradnl"/>
+        </w:rPr>
+        <w:t>git</w:t>
+      </w:r>
+      <w:proofErr w:type="spellEnd"/>
+      <w:r>
+        <w:rPr>
+          <w:lang w:val="es-ES_tradnl"/>
+        </w:rPr>
+        <w:t xml:space="preserve"> </w:t>
+      </w:r>
+      <w:proofErr w:type="spellStart"/>
+      <w:r>
+        <w:rPr>
+          <w:lang w:val="es-ES_tradnl"/>
+        </w:rPr>
+        <w:t>init</w:t>
+      </w:r>
+      <w:proofErr w:type="spellEnd"/>
+      <w:r>
+        <w:rPr>
+          <w:lang w:val="es-ES_tradnl"/>
+        </w:rPr>
+        <w:t xml:space="preserve"> para conectar </w:t>
+      </w:r>
+      <w:r>
+        <w:rPr>
+          <w:lang w:val="es-ES_tradnl"/>
+        </w:rPr>
+        <w:t>nuestro directorio con Git</w:t>
+      </w:r>
+      <w:r>
+        <w:rPr>
+          <w:lang w:val="es-ES_tradnl"/>
+        </w:rPr>
+        <w:t>:</w:t>
+      </w:r>
+    </w:p>
+    <w:p>
+      <w:pPr>
+        <w:pStyle w:val="Sinespaciado"/>
+        <w:jc w:val="both"/>
+        <w:rPr>
+          <w:lang w:val="es-ES_tradnl"/>
+        </w:rPr>
+      </w:pPr>
+    </w:p>
+    <w:p>
+      <w:pPr>
+        <w:pStyle w:val="Sinespaciado"/>
+        <w:jc w:val="both"/>
+        <w:rPr>
+          <w:lang w:val="es-ES_tradnl"/>
+        </w:rPr>
+      </w:pPr>
+      <w:r>
+        <w:rPr>
+          <w:lang w:val="es-ES_tradnl"/>
+        </w:rPr>
+        <w:drawing>
+          <wp:inline distT="0" distB="0" distL="0" distR="0" wp14:anchorId="730E5B54" wp14:editId="1BD3457F">
+            <wp:extent cx="5396230" cy="2261870"/>
+            <wp:effectExtent l="0" t="0" r="1270" b="0"/>
+            <wp:docPr id="2118123314" name="Imagen 1" descr="Texto&#10;&#10;El contenido generado por IA puede ser incorrecto."/>
+            <wp:cNvGraphicFramePr>
+              <a:graphicFrameLocks xmlns:a="http://schemas.openxmlformats.org/drawingml/2006/main" noChangeAspect="1"/>
+            </wp:cNvGraphicFramePr>
+            <a:graphic xmlns:a="http://schemas.openxmlformats.org/drawingml/2006/main">
+              <a:graphicData uri="http://schemas.openxmlformats.org/drawingml/2006/picture">
+                <pic:pic xmlns:pic="http://schemas.openxmlformats.org/drawingml/2006/picture">
+                  <pic:nvPicPr>
+                    <pic:cNvPr id="2118123314" name="Imagen 1" descr="Texto&#10;&#10;El contenido generado por IA puede ser incorrecto."/>
+                    <pic:cNvPicPr/>
+                  </pic:nvPicPr>
+                  <pic:blipFill>
+                    <a:blip r:embed="rId12"/>
+                    <a:stretch>
+                      <a:fillRect/>
+                    </a:stretch>
+                  </pic:blipFill>
+                  <pic:spPr>
+                    <a:xfrm>
+                      <a:off x="0" y="0"/>
+                      <a:ext cx="5396230" cy="2261870"/>
+                    </a:xfrm>
+                    <a:prstGeom prst="rect">
+                      <a:avLst/>
+                    </a:prstGeom>
+                  </pic:spPr>
+                </pic:pic>
+              </a:graphicData>
+            </a:graphic>
+          </wp:inline>
+        </w:drawing>
+      </w:r>
+    </w:p>
+    <w:p>
+      <w:pPr>
+        <w:pStyle w:val="Sinespaciado"/>
+        <w:jc w:val="both"/>
+        <w:rPr>
+          <w:lang w:val="es-ES_tradnl"/>
+        </w:rPr>
+      </w:pPr>
+    </w:p>
+    <w:p>
+      <w:pPr>
+        <w:pStyle w:val="Sinespaciado"/>
+        <w:numPr>
+          <w:ilvl w:val="0"/>
+          <w:numId w:val="2"/>
+        </w:numPr>
+        <w:jc w:val="both"/>
+        <w:rPr>
+          <w:lang w:val="es-ES_tradnl"/>
+        </w:rPr>
+      </w:pPr>
+      <w:r>
+        <w:rPr>
+          <w:lang w:val="es-ES_tradnl"/>
+        </w:rPr>
+        <w:t xml:space="preserve">Hacer el primer </w:t>
+      </w:r>
+      <w:proofErr w:type="spellStart"/>
+      <w:r>
+        <w:rPr>
+          <w:lang w:val="es-ES_tradnl"/>
+        </w:rPr>
+        <w:t>commit</w:t>
+      </w:r>
+      <w:proofErr w:type="spellEnd"/>
+      <w:r>
+        <w:rPr>
+          <w:lang w:val="es-ES_tradnl"/>
+        </w:rPr>
+        <w:t>:</w:t>
+      </w:r>
+    </w:p>
+    <w:p>
+      <w:pPr>
+        <w:pStyle w:val="Sinespaciado"/>
+        <w:numPr>
+          <w:ilvl w:val="1"/>
+          <w:numId w:val="2"/>
+        </w:numPr>
+        <w:jc w:val="both"/>
+        <w:rPr>
+          <w:lang w:val="es-ES_tradnl"/>
+        </w:rPr>
+      </w:pPr>
+      <w:r>
+        <w:rPr>
+          <w:lang w:val="es-ES_tradnl"/>
+        </w:rPr>
+        <w:t xml:space="preserve">Primero </w:t>
+      </w:r>
+      <w:proofErr w:type="spellStart"/>
+      <w:r>
+        <w:rPr>
+          <w:lang w:val="es-ES_tradnl"/>
+        </w:rPr>
+        <w:t>git</w:t>
+      </w:r>
+      <w:proofErr w:type="spellEnd"/>
+      <w:r>
+        <w:rPr>
+          <w:lang w:val="es-ES_tradnl"/>
+        </w:rPr>
+        <w:t xml:space="preserve"> </w:t>
+      </w:r>
+      <w:proofErr w:type="spellStart"/>
+      <w:proofErr w:type="gramStart"/>
+      <w:r>
+        <w:rPr>
+          <w:lang w:val="es-ES_tradnl"/>
+        </w:rPr>
+        <w:t>add</w:t>
+      </w:r>
+      <w:proofErr w:type="spellEnd"/>
+      <w:r>
+        <w:rPr>
+          <w:lang w:val="es-ES_tradnl"/>
+        </w:rPr>
+        <w:t xml:space="preserve"> .</w:t>
+      </w:r>
+      <w:proofErr w:type="gramEnd"/>
+      <w:r>
+        <w:rPr>
+          <w:lang w:val="es-ES_tradnl"/>
+        </w:rPr>
+        <w:t xml:space="preserve"> y luego </w:t>
+      </w:r>
+      <w:proofErr w:type="spellStart"/>
+      <w:r>
+        <w:rPr>
+          <w:lang w:val="es-ES_tradnl"/>
+        </w:rPr>
+        <w:t>git</w:t>
+      </w:r>
+      <w:proofErr w:type="spellEnd"/>
+      <w:r>
+        <w:rPr>
+          <w:lang w:val="es-ES_tradnl"/>
+        </w:rPr>
+        <w:t xml:space="preserve"> </w:t>
+      </w:r>
+      <w:proofErr w:type="spellStart"/>
+      <w:r>
+        <w:rPr>
+          <w:lang w:val="es-ES_tradnl"/>
+        </w:rPr>
+        <w:t>commit</w:t>
+      </w:r>
+      <w:proofErr w:type="spellEnd"/>
+      <w:r>
+        <w:rPr>
+          <w:lang w:val="es-ES_tradnl"/>
+        </w:rPr>
+        <w:t>:</w:t>
+      </w:r>
+    </w:p>
+    <w:p>
+      <w:pPr>
+        <w:pStyle w:val="Sinespaciado"/>
+        <w:jc w:val="both"/>
+        <w:rPr>
+          <w:lang w:val="es-ES_tradnl"/>
+        </w:rPr>
+      </w:pPr>
+    </w:p>
+    <w:p>
+      <w:pPr>
+        <w:pStyle w:val="Sinespaciado"/>
+        <w:jc w:val="both"/>
+        <w:rPr>
+          <w:lang w:val="es-ES_tradnl"/>
+        </w:rPr>
+      </w:pPr>
+      <w:r>
+        <w:rPr>
+          <w:lang w:val="es-ES_tradnl"/>
+        </w:rPr>
+        <w:drawing>
+          <wp:inline distT="0" distB="0" distL="0" distR="0" wp14:anchorId="483E2225" wp14:editId="4DB6827F">
+            <wp:extent cx="5396230" cy="1544955"/>
+            <wp:effectExtent l="0" t="0" r="1270" b="4445"/>
+            <wp:docPr id="1658987560" name="Imagen 1" descr="Texto&#10;&#10;El contenido generado por IA puede ser incorrecto."/>
+            <wp:cNvGraphicFramePr>
+              <a:graphicFrameLocks xmlns:a="http://schemas.openxmlformats.org/drawingml/2006/main" noChangeAspect="1"/>
+            </wp:cNvGraphicFramePr>
+            <a:graphic xmlns:a="http://schemas.openxmlformats.org/drawingml/2006/main">
+              <a:graphicData uri="http://schemas.openxmlformats.org/drawingml/2006/picture">
+                <pic:pic xmlns:pic="http://schemas.openxmlformats.org/drawingml/2006/picture">
+                  <pic:nvPicPr>
+                    <pic:cNvPr id="1658987560" name="Imagen 1" descr="Texto&#10;&#10;El contenido generado por IA puede ser incorrecto."/>
+                    <pic:cNvPicPr/>
+                  </pic:nvPicPr>
+                  <pic:blipFill>
+                    <a:blip r:embed="rId13"/>
+                    <a:stretch>
+                      <a:fillRect/>
+                    </a:stretch>
+                  </pic:blipFill>
+                  <pic:spPr>
+                    <a:xfrm>
+                      <a:off x="0" y="0"/>
+                      <a:ext cx="5396230" cy="1544955"/>
+                    </a:xfrm>
+                    <a:prstGeom prst="rect">
+                      <a:avLst/>
+                    </a:prstGeom>
+                  </pic:spPr>
+                </pic:pic>
+              </a:graphicData>
+            </a:graphic>
+          </wp:inline>
+        </w:drawing>
+      </w:r>
+    </w:p>
+    <w:p>
+      <w:pPr>
+        <w:pStyle w:val="Sinespaciado"/>
+        <w:jc w:val="both"/>
+        <w:rPr>
+          <w:lang w:val="es-ES_tradnl"/>
+        </w:rPr>
+      </w:pPr>
+      <w:r>
+        <w:rPr>
+          <w:lang w:val="es-ES_tradnl"/>
+        </w:rPr>
+        <w:t>…</w:t>
+      </w:r>
+    </w:p>
+    <w:p>
+      <w:pPr>
+        <w:pStyle w:val="Sinespaciado"/>
+        <w:jc w:val="both"/>
+        <w:rPr>
+          <w:lang w:val="es-ES_tradnl"/>
+        </w:rPr>
+      </w:pPr>
+    </w:p>
+    <w:p>
+      <w:pPr>
+        <w:pStyle w:val="Sinespaciado"/>
+        <w:numPr>
+          <w:ilvl w:val="0"/>
+          <w:numId w:val="2"/>
+        </w:numPr>
+        <w:jc w:val="both"/>
+        <w:rPr>
+          <w:lang w:val="es-ES_tradnl"/>
+        </w:rPr>
+      </w:pPr>
+      <w:r>
+        <w:rPr>
+          <w:lang w:val="es-ES_tradnl"/>
+        </w:rPr>
+        <w:t>Añadir el origen:</w:t>
+      </w:r>
+    </w:p>
+    <w:p>
+      <w:pPr>
+        <w:pStyle w:val="Sinespaciado"/>
+        <w:numPr>
+          <w:ilvl w:val="1"/>
+          <w:numId w:val="2"/>
+        </w:numPr>
+        <w:jc w:val="both"/>
+        <w:rPr>
+          <w:lang w:val="es-ES_tradnl"/>
+        </w:rPr>
+      </w:pPr>
+      <w:proofErr w:type="spellStart"/>
+      <w:r>
+        <w:rPr>
+          <w:lang w:val="es-ES_tradnl"/>
+        </w:rPr>
+        <w:t>git</w:t>
+      </w:r>
+      <w:proofErr w:type="spellEnd"/>
+      <w:r>
+        <w:rPr>
+          <w:lang w:val="es-ES_tradnl"/>
+        </w:rPr>
+        <w:t xml:space="preserve"> remote </w:t>
+      </w:r>
+      <w:proofErr w:type="spellStart"/>
+      <w:r>
+        <w:rPr>
+          <w:lang w:val="es-ES_tradnl"/>
+        </w:rPr>
+        <w:t>add</w:t>
+      </w:r>
+      <w:proofErr w:type="spellEnd"/>
+      <w:r>
+        <w:rPr>
+          <w:lang w:val="es-ES_tradnl"/>
+        </w:rPr>
+        <w:t xml:space="preserve"> </w:t>
+      </w:r>
+      <w:proofErr w:type="spellStart"/>
+      <w:r>
+        <w:rPr>
+          <w:lang w:val="es-ES_tradnl"/>
+        </w:rPr>
+        <w:t>origin</w:t>
+      </w:r>
+      <w:proofErr w:type="spellEnd"/>
+      <w:r>
+        <w:rPr>
+          <w:lang w:val="es-ES_tradnl"/>
+        </w:rPr>
+        <w:t xml:space="preserve"> </w:t>
+      </w:r>
+      <w:proofErr w:type="spellStart"/>
+      <w:proofErr w:type="gramStart"/>
+      <w:r>
+        <w:rPr>
+          <w:lang w:val="es-ES_tradnl"/>
+        </w:rPr>
+        <w:t>git@github.com:pablo-crg</w:t>
+      </w:r>
+      <w:proofErr w:type="spellEnd"/>
+      <w:r>
+        <w:rPr>
+          <w:lang w:val="es-ES_tradnl"/>
+        </w:rPr>
+        <w:t>/pablo-</w:t>
+      </w:r>
+      <w:proofErr w:type="spellStart"/>
+      <w:r>
+        <w:rPr>
+          <w:lang w:val="es-ES_tradnl"/>
+        </w:rPr>
+        <w:t>crg.github.io.git</w:t>
+      </w:r>
+      <w:proofErr w:type="spellEnd"/>
+      <w:proofErr w:type="gramEnd"/>
+    </w:p>
+    <w:p>
+      <w:pPr>
+        <w:pStyle w:val="Sinespaciado"/>
+        <w:jc w:val="both"/>
+        <w:rPr>
+          <w:lang w:val="es-ES_tradnl"/>
+        </w:rPr>
+      </w:pPr>
+    </w:p>
+    <w:p>
+      <w:pPr>
+        <w:pStyle w:val="Sinespaciado"/>
+        <w:jc w:val="both"/>
+        <w:rPr>
+          <w:lang w:val="es-ES_tradnl"/>
+        </w:rPr>
+      </w:pPr>
+      <w:r>
+        <w:rPr>
+          <w:lang w:val="es-ES_tradnl"/>
+        </w:rPr>
+        <w:drawing>
+          <wp:inline distT="0" distB="0" distL="0" distR="0" wp14:anchorId="7014E698" wp14:editId="5C7AD813">
+            <wp:extent cx="5396230" cy="273685"/>
+            <wp:effectExtent l="0" t="0" r="1270" b="5715"/>
+            <wp:docPr id="1491398670" name="Imagen 1"/>
+            <wp:cNvGraphicFramePr>
+              <a:graphicFrameLocks xmlns:a="http://schemas.openxmlformats.org/drawingml/2006/main" noChangeAspect="1"/>
+            </wp:cNvGraphicFramePr>
+            <a:graphic xmlns:a="http://schemas.openxmlformats.org/drawingml/2006/main">
+              <a:graphicData uri="http://schemas.openxmlformats.org/drawingml/2006/picture">
+                <pic:pic xmlns:pic="http://schemas.openxmlformats.org/drawingml/2006/picture">
+                  <pic:nvPicPr>
+                    <pic:cNvPr id="1491398670" name=""/>
+                    <pic:cNvPicPr/>
+                  </pic:nvPicPr>
+                  <pic:blipFill>
+                    <a:blip r:embed="rId14"/>
+                    <a:stretch>
+                      <a:fillRect/>
+                    </a:stretch>
+                  </pic:blipFill>
+                  <pic:spPr>
+                    <a:xfrm>
+                      <a:off x="0" y="0"/>
+                      <a:ext cx="5396230" cy="273685"/>
+                    </a:xfrm>
+                    <a:prstGeom prst="rect">
+                      <a:avLst/>
+                    </a:prstGeom>
+                  </pic:spPr>
+                </pic:pic>
+              </a:graphicData>
+            </a:graphic>
+          </wp:inline>
+        </w:drawing>
+      </w:r>
+    </w:p>
+    <w:p>
+      <w:pPr>
+        <w:pStyle w:val="Sinespaciado"/>
+        <w:jc w:val="both"/>
+        <w:rPr>
+          <w:lang w:val="es-ES_tradnl"/>
+        </w:rPr>
+      </w:pPr>
+    </w:p>
+    <w:p>
+      <w:pPr>
+        <w:pStyle w:val="Sinespaciado"/>
+        <w:numPr>
+          <w:ilvl w:val="0"/>
+          <w:numId w:val="2"/>
+        </w:numPr>
+        <w:jc w:val="both"/>
+        <w:rPr>
+          <w:lang w:val="es-ES_tradnl"/>
+        </w:rPr>
+      </w:pPr>
+      <w:r>
+        <w:rPr>
+          <w:lang w:val="es-ES_tradnl"/>
+        </w:rPr>
+        <w:t>Hay que cambiar el nombre de la rama principal que, por defecto, se llama “</w:t>
+      </w:r>
+      <w:proofErr w:type="gramStart"/>
+      <w:r>
+        <w:rPr>
+          <w:lang w:val="es-ES_tradnl"/>
+        </w:rPr>
+        <w:t>master</w:t>
+      </w:r>
+      <w:proofErr w:type="gramEnd"/>
+      <w:r>
+        <w:rPr>
+          <w:lang w:val="es-ES_tradnl"/>
+        </w:rPr>
+        <w:t>” y GitHub y los estándares actuales la llaman “</w:t>
+      </w:r>
+      <w:proofErr w:type="spellStart"/>
+      <w:r>
+        <w:rPr>
+          <w:lang w:val="es-ES_tradnl"/>
+        </w:rPr>
+        <w:t>main</w:t>
+      </w:r>
+      <w:proofErr w:type="spellEnd"/>
+      <w:r>
+        <w:rPr>
+          <w:lang w:val="es-ES_tradnl"/>
+        </w:rPr>
+        <w:t>”:</w:t>
+      </w:r>
+    </w:p>
+    <w:p>
+      <w:pPr>
+        <w:pStyle w:val="Sinespaciado"/>
+        <w:jc w:val="both"/>
+        <w:rPr>
+          <w:lang w:val="es-ES_tradnl"/>
+        </w:rPr>
+      </w:pPr>
+    </w:p>
+    <w:p>
+      <w:pPr>
+        <w:pStyle w:val="Sinespaciado"/>
+        <w:jc w:val="both"/>
+        <w:rPr>
+          <w:lang w:val="es-ES_tradnl"/>
+        </w:rPr>
+      </w:pPr>
+      <w:r>
+        <w:rPr>
+          <w:lang w:val="es-ES_tradnl"/>
+        </w:rPr>
+        <w:drawing>
+          <wp:inline distT="0" distB="0" distL="0" distR="0" wp14:anchorId="4983F7AA" wp14:editId="6B76D414">
+            <wp:extent cx="5396230" cy="399415"/>
+            <wp:effectExtent l="0" t="0" r="1270" b="0"/>
+            <wp:docPr id="371284467" name="Imagen 1"/>
+            <wp:cNvGraphicFramePr>
+              <a:graphicFrameLocks xmlns:a="http://schemas.openxmlformats.org/drawingml/2006/main" noChangeAspect="1"/>
+            </wp:cNvGraphicFramePr>
+            <a:graphic xmlns:a="http://schemas.openxmlformats.org/drawingml/2006/main">
+              <a:graphicData uri="http://schemas.openxmlformats.org/drawingml/2006/picture">
+                <pic:pic xmlns:pic="http://schemas.openxmlformats.org/drawingml/2006/picture">
+                  <pic:nvPicPr>
+                    <pic:cNvPr id="371284467" name=""/>
+                    <pic:cNvPicPr/>
+                  </pic:nvPicPr>
+                  <pic:blipFill>
+                    <a:blip r:embed="rId15"/>
+                    <a:stretch>
+                      <a:fillRect/>
+                    </a:stretch>
+                  </pic:blipFill>
+                  <pic:spPr>
+                    <a:xfrm>
+                      <a:off x="0" y="0"/>
+                      <a:ext cx="5396230" cy="399415"/>
+                    </a:xfrm>
+                    <a:prstGeom prst="rect">
+                      <a:avLst/>
+                    </a:prstGeom>
+                  </pic:spPr>
+                </pic:pic>
+              </a:graphicData>
+            </a:graphic>
+          </wp:inline>
+        </w:drawing>
+      </w:r>
+    </w:p>
+    <w:p>
+      <w:pPr>
+        <w:pStyle w:val="Sinespaciado"/>
+        <w:jc w:val="both"/>
+        <w:rPr>
+          <w:lang w:val="es-ES_tradnl"/>
+        </w:rPr>
+      </w:pPr>
+    </w:p>
+    <w:p>
+      <w:pPr>
+        <w:pStyle w:val="Sinespaciado"/>
+        <w:numPr>
+          <w:ilvl w:val="0"/>
+          <w:numId w:val="2"/>
+        </w:numPr>
+        <w:jc w:val="both"/>
+        <w:rPr>
+          <w:lang w:val="es-ES_tradnl"/>
+        </w:rPr>
+      </w:pPr>
+      <w:r>
+        <w:rPr>
+          <w:lang w:val="es-ES_tradnl"/>
+        </w:rPr>
+        <w:t>Hacemos las modificaciones oportunas y realizamos un nuevo “</w:t>
+      </w:r>
+      <w:proofErr w:type="spellStart"/>
+      <w:r>
+        <w:rPr>
+          <w:lang w:val="es-ES_tradnl"/>
+        </w:rPr>
+        <w:t>commit</w:t>
+      </w:r>
+      <w:proofErr w:type="spellEnd"/>
+      <w:r>
+        <w:rPr>
+          <w:lang w:val="es-ES_tradnl"/>
+        </w:rPr>
+        <w:t>”:</w:t>
+      </w:r>
+    </w:p>
+    <w:p>
+      <w:pPr>
+        <w:pStyle w:val="Sinespaciado"/>
+        <w:jc w:val="both"/>
+        <w:rPr>
+          <w:lang w:val="es-ES_tradnl"/>
+        </w:rPr>
+      </w:pPr>
+    </w:p>
+    <w:p>
+      <w:pPr>
+        <w:pStyle w:val="Sinespaciado"/>
+        <w:jc w:val="both"/>
+        <w:rPr>
+          <w:lang w:val="es-ES_tradnl"/>
+        </w:rPr>
+      </w:pPr>
+      <w:r>
+        <w:rPr>
+          <w:lang w:val="es-ES_tradnl"/>
+        </w:rPr>
+        <w:lastRenderedPageBreak/>
+        <w:drawing>
+          <wp:inline distT="0" distB="0" distL="0" distR="0" wp14:anchorId="03F70716" wp14:editId="38C02E20">
+            <wp:extent cx="5396230" cy="1071880"/>
+            <wp:effectExtent l="0" t="0" r="1270" b="0"/>
+            <wp:docPr id="642038955" name="Imagen 1" descr="Texto&#10;&#10;El contenido generado por IA puede ser incorrecto."/>
+            <wp:cNvGraphicFramePr>
+              <a:graphicFrameLocks xmlns:a="http://schemas.openxmlformats.org/drawingml/2006/main" noChangeAspect="1"/>
+            </wp:cNvGraphicFramePr>
+            <a:graphic xmlns:a="http://schemas.openxmlformats.org/drawingml/2006/main">
+              <a:graphicData uri="http://schemas.openxmlformats.org/drawingml/2006/picture">
+                <pic:pic xmlns:pic="http://schemas.openxmlformats.org/drawingml/2006/picture">
+                  <pic:nvPicPr>
+                    <pic:cNvPr id="642038955" name="Imagen 1" descr="Texto&#10;&#10;El contenido generado por IA puede ser incorrecto."/>
+                    <pic:cNvPicPr/>
+                  </pic:nvPicPr>
+                  <pic:blipFill>
+                    <a:blip r:embed="rId16"/>
+                    <a:stretch>
+                      <a:fillRect/>
+                    </a:stretch>
+                  </pic:blipFill>
+                  <pic:spPr>
+                    <a:xfrm>
+                      <a:off x="0" y="0"/>
+                      <a:ext cx="5396230" cy="1071880"/>
+                    </a:xfrm>
+                    <a:prstGeom prst="rect">
+                      <a:avLst/>
+                    </a:prstGeom>
+                  </pic:spPr>
+                </pic:pic>
+              </a:graphicData>
+            </a:graphic>
+          </wp:inline>
+        </w:drawing>
+      </w:r>
+    </w:p>
+    <w:p>
+      <w:pPr>
+        <w:pStyle w:val="Sinespaciado"/>
+        <w:jc w:val="both"/>
+        <w:rPr>
+          <w:lang w:val="es-ES_tradnl"/>
+        </w:rPr>
+      </w:pPr>
+    </w:p>
+    <w:p>
+      <w:pPr>
+        <w:pStyle w:val="Sinespaciado"/>
+        <w:numPr>
+          <w:ilvl w:val="0"/>
+          <w:numId w:val="2"/>
+        </w:numPr>
+        <w:jc w:val="both"/>
+        <w:rPr>
+          <w:lang w:val="es-ES_tradnl"/>
+        </w:rPr>
+      </w:pPr>
+      <w:r>
+        <w:rPr>
+          <w:lang w:val="es-ES_tradnl"/>
+        </w:rPr>
+        <w:t>Ahora tenemos que ir a GitHub y crear el repositorio vacío exacto:</w:t>
+      </w:r>
+    </w:p>
+    <w:p>
+      <w:pPr>
+        <w:pStyle w:val="Sinespaciado"/>
+        <w:numPr>
+          <w:ilvl w:val="1"/>
+          <w:numId w:val="2"/>
+        </w:numPr>
+        <w:jc w:val="both"/>
+        <w:rPr>
+          <w:lang w:val="es-ES_tradnl"/>
+        </w:rPr>
+      </w:pPr>
+      <w:r>
+        <w:rPr>
+          <w:lang w:val="es-ES_tradnl"/>
+        </w:rPr>
+        <w:t>Vamos a GitHub</w:t>
+      </w:r>
+    </w:p>
+    <w:p>
+      <w:pPr>
+        <w:pStyle w:val="Sinespaciado"/>
+        <w:numPr>
+          <w:ilvl w:val="1"/>
+          <w:numId w:val="2"/>
+        </w:numPr>
+        <w:jc w:val="both"/>
+        <w:rPr>
+          <w:lang w:val="es-ES_tradnl"/>
+        </w:rPr>
+      </w:pPr>
+      <w:r>
+        <w:rPr>
+          <w:lang w:val="es-ES_tradnl"/>
+        </w:rPr>
+        <w:t xml:space="preserve">Botón New </w:t>
+      </w:r>
+      <w:proofErr w:type="spellStart"/>
+      <w:r>
+        <w:rPr>
+          <w:lang w:val="es-ES_tradnl"/>
+        </w:rPr>
+        <w:t>repository</w:t>
+      </w:r>
+      <w:proofErr w:type="spellEnd"/>
+    </w:p>
+    <w:p>
+      <w:pPr>
+        <w:pStyle w:val="Sinespaciado"/>
+        <w:numPr>
+          <w:ilvl w:val="1"/>
+          <w:numId w:val="2"/>
+        </w:numPr>
+        <w:jc w:val="both"/>
+        <w:rPr>
+          <w:lang w:val="es-ES_tradnl"/>
+        </w:rPr>
+      </w:pPr>
+      <w:r>
+        <w:rPr>
+          <w:lang w:val="es-ES_tradnl"/>
+        </w:rPr>
+        <w:t>Nombre: pablo-crg.github.io (exactamente así)</w:t>
+      </w:r>
+    </w:p>
+    <w:p>
+      <w:pPr>
+        <w:pStyle w:val="Sinespaciado"/>
+        <w:numPr>
+          <w:ilvl w:val="1"/>
+          <w:numId w:val="2"/>
+        </w:numPr>
+        <w:jc w:val="both"/>
+        <w:rPr>
+          <w:lang w:val="es-ES_tradnl"/>
+        </w:rPr>
+      </w:pPr>
+      <w:r>
+        <w:rPr>
+          <w:lang w:val="es-ES_tradnl"/>
+        </w:rPr>
+        <w:t>Sin README ni nada (puede estar vacío)</w:t>
+      </w:r>
+    </w:p>
+    <w:p>
+      <w:pPr>
+        <w:pStyle w:val="Sinespaciado"/>
+        <w:numPr>
+          <w:ilvl w:val="1"/>
+          <w:numId w:val="2"/>
+        </w:numPr>
+        <w:jc w:val="both"/>
+        <w:rPr>
+          <w:lang w:val="es-ES_tradnl"/>
+        </w:rPr>
+      </w:pPr>
+      <w:r>
+        <w:rPr>
+          <w:lang w:val="es-ES_tradnl"/>
+        </w:rPr>
+        <w:t>Crea el repositorio</w:t>
+      </w:r>
+    </w:p>
+    <w:p>
+      <w:pPr>
+        <w:pStyle w:val="Sinespaciado"/>
+        <w:jc w:val="both"/>
+        <w:rPr>
+          <w:lang w:val="es-ES_tradnl"/>
+        </w:rPr>
+      </w:pPr>
+    </w:p>
+    <w:p>
+      <w:pPr>
+        <w:pStyle w:val="Sinespaciado"/>
+        <w:jc w:val="both"/>
+        <w:rPr>
+          <w:lang w:val="es-ES_tradnl"/>
+        </w:rPr>
+      </w:pPr>
+      <w:r>
+        <w:rPr>
+          <w:lang w:val="es-ES_tradnl"/>
+        </w:rPr>
+        <w:drawing>
+          <wp:inline distT="0" distB="0" distL="0" distR="0" wp14:anchorId="31C3DF8E" wp14:editId="437F629B">
+            <wp:extent cx="5396230" cy="2231390"/>
+            <wp:effectExtent l="0" t="0" r="1270" b="3810"/>
+            <wp:docPr id="600462344" name="Imagen 1" descr="Interfaz de usuario gráfica, Texto, Aplicación&#10;&#10;El contenido generado por IA puede ser incorrecto."/>
+            <wp:cNvGraphicFramePr>
+              <a:graphicFrameLocks xmlns:a="http://schemas.openxmlformats.org/drawingml/2006/main" noChangeAspect="1"/>
+            </wp:cNvGraphicFramePr>
+            <a:graphic xmlns:a="http://schemas.openxmlformats.org/drawingml/2006/main">
+              <a:graphicData uri="http://schemas.openxmlformats.org/drawingml/2006/picture">
+                <pic:pic xmlns:pic="http://schemas.openxmlformats.org/drawingml/2006/picture">
+                  <pic:nvPicPr>
+                    <pic:cNvPr id="600462344" name="Imagen 1" descr="Interfaz de usuario gráfica, Texto, Aplicación&#10;&#10;El contenido generado por IA puede ser incorrecto."/>
+                    <pic:cNvPicPr/>
+                  </pic:nvPicPr>
+                  <pic:blipFill>
+                    <a:blip r:embed="rId17"/>
+                    <a:stretch>
+                      <a:fillRect/>
+                    </a:stretch>
+                  </pic:blipFill>
+                  <pic:spPr>
+                    <a:xfrm>
+                      <a:off x="0" y="0"/>
+                      <a:ext cx="5396230" cy="2231390"/>
+                    </a:xfrm>
+                    <a:prstGeom prst="rect">
+                      <a:avLst/>
+                    </a:prstGeom>
+                  </pic:spPr>
+                </pic:pic>
+              </a:graphicData>
+            </a:graphic>
+          </wp:inline>
+        </w:drawing>
+      </w:r>
+    </w:p>
+    <w:p>
+      <w:pPr>
+        <w:pStyle w:val="Sinespaciado"/>
+        <w:jc w:val="both"/>
+        <w:rPr>
+          <w:lang w:val="es-ES_tradnl"/>
+        </w:rPr>
+      </w:pPr>
+    </w:p>
+    <w:p>
+      <w:pPr>
+        <w:pStyle w:val="Sinespaciado"/>
+        <w:numPr>
+          <w:ilvl w:val="0"/>
+          <w:numId w:val="2"/>
+        </w:numPr>
+        <w:jc w:val="both"/>
+        <w:rPr>
+          <w:lang w:val="es-ES_tradnl"/>
+        </w:rPr>
+      </w:pPr>
+      <w:r>
+        <w:rPr>
+          <w:lang w:val="es-ES_tradnl"/>
+        </w:rPr>
+        <w:t>Comprobamos el remoto en el Mac:</w:t>
+      </w:r>
+    </w:p>
+    <w:p>
+      <w:pPr>
+        <w:pStyle w:val="Sinespaciado"/>
+        <w:jc w:val="both"/>
+        <w:rPr>
+          <w:lang w:val="es-ES_tradnl"/>
+        </w:rPr>
+      </w:pPr>
+    </w:p>
+    <w:p>
+      <w:pPr>
+        <w:pStyle w:val="Sinespaciado"/>
+        <w:jc w:val="both"/>
+        <w:rPr>
+          <w:lang w:val="es-ES_tradnl"/>
+        </w:rPr>
+      </w:pPr>
+      <w:r>
+        <w:rPr>
+          <w:lang w:val="es-ES_tradnl"/>
+        </w:rPr>
+        <w:drawing>
+          <wp:inline distT="0" distB="0" distL="0" distR="0" wp14:anchorId="4BBB0958" wp14:editId="4CBCA229">
+            <wp:extent cx="5396230" cy="539750"/>
+            <wp:effectExtent l="0" t="0" r="1270" b="6350"/>
+            <wp:docPr id="1604906248" name="Imagen 1"/>
+            <wp:cNvGraphicFramePr>
+              <a:graphicFrameLocks xmlns:a="http://schemas.openxmlformats.org/drawingml/2006/main" noChangeAspect="1"/>
+            </wp:cNvGraphicFramePr>
+            <a:graphic xmlns:a="http://schemas.openxmlformats.org/drawingml/2006/main">
+              <a:graphicData uri="http://schemas.openxmlformats.org/drawingml/2006/picture">
+                <pic:pic xmlns:pic="http://schemas.openxmlformats.org/drawingml/2006/picture">
+                  <pic:nvPicPr>
+                    <pic:cNvPr id="1604906248" name=""/>
+                    <pic:cNvPicPr/>
+                  </pic:nvPicPr>
+                  <pic:blipFill>
+                    <a:blip r:embed="rId18"/>
+                    <a:stretch>
+                      <a:fillRect/>
+                    </a:stretch>
+                  </pic:blipFill>
+                  <pic:spPr>
+                    <a:xfrm>
+                      <a:off x="0" y="0"/>
+                      <a:ext cx="5396230" cy="539750"/>
+                    </a:xfrm>
+                    <a:prstGeom prst="rect">
+                      <a:avLst/>
+                    </a:prstGeom>
+                  </pic:spPr>
+                </pic:pic>
+              </a:graphicData>
+            </a:graphic>
+          </wp:inline>
+        </w:drawing>
+      </w:r>
+    </w:p>
+    <w:p>
+      <w:pPr>
+        <w:pStyle w:val="Sinespaciado"/>
+        <w:jc w:val="both"/>
+        <w:rPr>
+          <w:lang w:val="es-ES_tradnl"/>
+        </w:rPr>
+      </w:pPr>
+    </w:p>
+    <w:p>
+      <w:pPr>
+        <w:pStyle w:val="Sinespaciado"/>
+        <w:numPr>
+          <w:ilvl w:val="1"/>
+          <w:numId w:val="2"/>
+        </w:numPr>
+        <w:jc w:val="both"/>
+        <w:rPr>
+          <w:lang w:val="es-ES_tradnl"/>
+        </w:rPr>
+      </w:pPr>
+      <w:r>
+        <w:rPr>
+          <w:lang w:val="es-ES_tradnl"/>
+        </w:rPr>
+        <w:t>Si no coincidiera, deberíamos corregirlo (en nuestro caso sí lo hizo, lo pongo a modo de enseñanza)</w:t>
+      </w:r>
+    </w:p>
+    <w:p>
+      <w:pPr>
+        <w:pStyle w:val="Sinespaciado"/>
+        <w:jc w:val="both"/>
+        <w:rPr>
+          <w:lang w:val="es-ES_tradnl"/>
+        </w:rPr>
+      </w:pPr>
+    </w:p>
+    <w:p>
+      <w:pPr>
+        <w:pStyle w:val="Sinespaciado"/>
+        <w:jc w:val="both"/>
+        <w:rPr>
+          <w:lang w:val="es-ES_tradnl"/>
+        </w:rPr>
+      </w:pPr>
+      <w:r>
+        <w:rPr>
+          <w:lang w:val="es-ES_tradnl"/>
+        </w:rPr>
+        <w:drawing>
+          <wp:inline distT="0" distB="0" distL="0" distR="0" wp14:anchorId="5AD680B1" wp14:editId="71666AE3">
+            <wp:extent cx="5396230" cy="202565"/>
+            <wp:effectExtent l="0" t="0" r="1270" b="635"/>
+            <wp:docPr id="254444868" name="Imagen 1"/>
+            <wp:cNvGraphicFramePr>
+              <a:graphicFrameLocks xmlns:a="http://schemas.openxmlformats.org/drawingml/2006/main" noChangeAspect="1"/>
+            </wp:cNvGraphicFramePr>
+            <a:graphic xmlns:a="http://schemas.openxmlformats.org/drawingml/2006/main">
+              <a:graphicData uri="http://schemas.openxmlformats.org/drawingml/2006/picture">
+                <pic:pic xmlns:pic="http://schemas.openxmlformats.org/drawingml/2006/picture">
+                  <pic:nvPicPr>
+                    <pic:cNvPr id="254444868" name=""/>
+                    <pic:cNvPicPr/>
+                  </pic:nvPicPr>
+                  <pic:blipFill>
+                    <a:blip r:embed="rId19"/>
+                    <a:stretch>
+                      <a:fillRect/>
+                    </a:stretch>
+                  </pic:blipFill>
+                  <pic:spPr>
+                    <a:xfrm>
+                      <a:off x="0" y="0"/>
+                      <a:ext cx="5396230" cy="202565"/>
+                    </a:xfrm>
+                    <a:prstGeom prst="rect">
+                      <a:avLst/>
+                    </a:prstGeom>
+                  </pic:spPr>
+                </pic:pic>
+              </a:graphicData>
+            </a:graphic>
+          </wp:inline>
+        </w:drawing>
+      </w:r>
+    </w:p>
+    <w:p>
+      <w:pPr>
+        <w:pStyle w:val="Sinespaciado"/>
+        <w:jc w:val="both"/>
+        <w:rPr>
+          <w:lang w:val="es-ES_tradnl"/>
+        </w:rPr>
+      </w:pPr>
+    </w:p>
+    <w:p>
+      <w:pPr>
+        <w:pStyle w:val="Sinespaciado"/>
+        <w:numPr>
+          <w:ilvl w:val="0"/>
+          <w:numId w:val="2"/>
+        </w:numPr>
+        <w:jc w:val="both"/>
+        <w:rPr>
+          <w:lang w:val="es-ES_tradnl"/>
+        </w:rPr>
+      </w:pPr>
+      <w:r>
+        <w:rPr>
+          <w:lang w:val="es-ES_tradnl"/>
+        </w:rPr>
+        <w:t xml:space="preserve">Hacemos el </w:t>
+      </w:r>
+      <w:proofErr w:type="spellStart"/>
+      <w:r>
+        <w:rPr>
+          <w:lang w:val="es-ES_tradnl"/>
+        </w:rPr>
+        <w:t>push</w:t>
+      </w:r>
+      <w:proofErr w:type="spellEnd"/>
+      <w:r>
+        <w:rPr>
+          <w:lang w:val="es-ES_tradnl"/>
+        </w:rPr>
+        <w:t>:</w:t>
+      </w:r>
+    </w:p>
+    <w:p>
+      <w:pPr>
+        <w:pStyle w:val="Sinespaciado"/>
+        <w:jc w:val="both"/>
+        <w:rPr>
+          <w:lang w:val="es-ES_tradnl"/>
+        </w:rPr>
+      </w:pPr>
+    </w:p>
+    <w:p>
+      <w:pPr>
+        <w:pStyle w:val="Sinespaciado"/>
+        <w:jc w:val="both"/>
+        <w:rPr>
+          <w:lang w:val="es-ES_tradnl"/>
+        </w:rPr>
+      </w:pPr>
+      <w:r>
+        <w:rPr>
+          <w:lang w:val="es-ES_tradnl"/>
+        </w:rPr>
+        <w:drawing>
+          <wp:inline distT="0" distB="0" distL="0" distR="0" wp14:anchorId="62F6A03A" wp14:editId="73BA470E">
+            <wp:extent cx="5396230" cy="1463675"/>
+            <wp:effectExtent l="0" t="0" r="1270" b="0"/>
+            <wp:docPr id="1749925940" name="Imagen 1" descr="Texto&#10;&#10;El contenido generado por IA puede ser incorrecto."/>
+            <wp:cNvGraphicFramePr>
+              <a:graphicFrameLocks xmlns:a="http://schemas.openxmlformats.org/drawingml/2006/main" noChangeAspect="1"/>
+            </wp:cNvGraphicFramePr>
+            <a:graphic xmlns:a="http://schemas.openxmlformats.org/drawingml/2006/main">
+              <a:graphicData uri="http://schemas.openxmlformats.org/drawingml/2006/picture">
+                <pic:pic xmlns:pic="http://schemas.openxmlformats.org/drawingml/2006/picture">
+                  <pic:nvPicPr>
+                    <pic:cNvPr id="1749925940" name="Imagen 1" descr="Texto&#10;&#10;El contenido generado por IA puede ser incorrecto."/>
+                    <pic:cNvPicPr/>
+                  </pic:nvPicPr>
+                  <pic:blipFill>
+                    <a:blip r:embed="rId20"/>
+                    <a:stretch>
+                      <a:fillRect/>
+                    </a:stretch>
+                  </pic:blipFill>
+                  <pic:spPr>
+                    <a:xfrm>
+                      <a:off x="0" y="0"/>
+                      <a:ext cx="5396230" cy="1463675"/>
+                    </a:xfrm>
+                    <a:prstGeom prst="rect">
+                      <a:avLst/>
+                    </a:prstGeom>
+                  </pic:spPr>
+                </pic:pic>
+              </a:graphicData>
+            </a:graphic>
+          </wp:inline>
+        </w:drawing>
+      </w:r>
+    </w:p>
+    <w:p>
+      <w:pPr>
+        <w:pStyle w:val="Sinespaciado"/>
+        <w:jc w:val="both"/>
+        <w:rPr>
+          <w:lang w:val="es-ES_tradnl"/>
+        </w:rPr>
+      </w:pPr>
+    </w:p>
+    <w:p>
+      <w:pPr>
+        <w:pStyle w:val="Sinespaciado"/>
+        <w:numPr>
+          <w:ilvl w:val="0"/>
+          <w:numId w:val="2"/>
+        </w:numPr>
+        <w:jc w:val="both"/>
+        <w:rPr>
+          <w:lang w:val="es-ES_tradnl"/>
+        </w:rPr>
+      </w:pPr>
+      <w:r>
+        <w:rPr>
+          <w:lang w:val="es-ES_tradnl"/>
+        </w:rPr>
+        <w:t>Ahora tenemos que activar la web:</w:t>
+      </w:r>
+    </w:p>
+    <w:p>
+      <w:pPr>
+        <w:pStyle w:val="Sinespaciado"/>
+        <w:numPr>
+          <w:ilvl w:val="1"/>
+          <w:numId w:val="2"/>
+        </w:numPr>
+        <w:jc w:val="both"/>
+        <w:rPr>
+          <w:lang w:val="es-ES_tradnl"/>
+        </w:rPr>
+      </w:pPr>
+      <w:r>
+        <w:rPr>
+          <w:lang w:val="es-ES_tradnl"/>
+        </w:rPr>
+        <w:t>Vamos al repositorio pablo-crg.github.io</w:t>
+      </w:r>
+    </w:p>
+    <w:p>
+      <w:pPr>
+        <w:pStyle w:val="Sinespaciado"/>
+        <w:numPr>
+          <w:ilvl w:val="1"/>
+          <w:numId w:val="2"/>
+        </w:numPr>
+        <w:jc w:val="both"/>
+        <w:rPr>
+          <w:lang w:val="es-ES_tradnl"/>
+        </w:rPr>
+      </w:pPr>
+      <w:r>
+        <w:rPr>
+          <w:lang w:val="es-ES_tradnl"/>
+        </w:rPr>
+        <w:t>Dentro del repositorio, arriba, hay varias pestañas (</w:t>
+      </w:r>
+      <w:proofErr w:type="spellStart"/>
+      <w:r>
+        <w:rPr>
+          <w:lang w:val="es-ES_tradnl"/>
+        </w:rPr>
+        <w:t>Code</w:t>
+      </w:r>
+      <w:proofErr w:type="spellEnd"/>
+      <w:r>
+        <w:rPr>
+          <w:lang w:val="es-ES_tradnl"/>
+        </w:rPr>
+        <w:t xml:space="preserve">, Issues, </w:t>
+      </w:r>
+      <w:proofErr w:type="spellStart"/>
+      <w:r>
+        <w:rPr>
+          <w:lang w:val="es-ES_tradnl"/>
+        </w:rPr>
+        <w:t>Pull</w:t>
+      </w:r>
+      <w:proofErr w:type="spellEnd"/>
+      <w:r>
+        <w:rPr>
+          <w:lang w:val="es-ES_tradnl"/>
+        </w:rPr>
+        <w:t xml:space="preserve"> </w:t>
+      </w:r>
+      <w:proofErr w:type="spellStart"/>
+      <w:r>
+        <w:rPr>
+          <w:lang w:val="es-ES_tradnl"/>
+        </w:rPr>
+        <w:t>requests</w:t>
+      </w:r>
+      <w:proofErr w:type="spellEnd"/>
+      <w:r>
+        <w:rPr>
+          <w:lang w:val="es-ES_tradnl"/>
+        </w:rPr>
+        <w:t xml:space="preserve">, …, </w:t>
+      </w:r>
+      <w:proofErr w:type="spellStart"/>
+      <w:r>
+        <w:rPr>
+          <w:lang w:val="es-ES_tradnl"/>
+        </w:rPr>
+        <w:t>Settings</w:t>
+      </w:r>
+      <w:proofErr w:type="spellEnd"/>
+      <w:r>
+        <w:rPr>
+          <w:lang w:val="es-ES_tradnl"/>
+        </w:rPr>
+        <w:t>)</w:t>
+      </w:r>
+    </w:p>
+    <w:p>
+      <w:pPr>
+        <w:pStyle w:val="Sinespaciado"/>
+        <w:numPr>
+          <w:ilvl w:val="1"/>
+          <w:numId w:val="2"/>
+        </w:numPr>
+        <w:jc w:val="both"/>
+        <w:rPr>
+          <w:lang w:val="es-ES_tradnl"/>
+        </w:rPr>
+      </w:pPr>
+      <w:r>
+        <w:rPr>
+          <w:lang w:val="es-ES_tradnl"/>
+        </w:rPr>
+        <w:t xml:space="preserve">Hacemos clic en </w:t>
+      </w:r>
+      <w:proofErr w:type="spellStart"/>
+      <w:r>
+        <w:rPr>
+          <w:lang w:val="es-ES_tradnl"/>
+        </w:rPr>
+        <w:t>Settings</w:t>
+      </w:r>
+      <w:proofErr w:type="spellEnd"/>
+    </w:p>
+    <w:p>
+      <w:pPr>
+        <w:pStyle w:val="Sinespaciado"/>
+        <w:numPr>
+          <w:ilvl w:val="1"/>
+          <w:numId w:val="2"/>
+        </w:numPr>
+        <w:jc w:val="both"/>
+        <w:rPr>
+          <w:lang w:val="es-ES_tradnl"/>
+        </w:rPr>
+      </w:pPr>
+      <w:r>
+        <w:rPr>
+          <w:lang w:val="es-ES_tradnl"/>
+        </w:rPr>
+        <w:t>En el menú lateral del repositorio, veremos “Pages”. Entramos ahí y lo configuramos de la siguiente forma:</w:t>
+      </w:r>
+    </w:p>
+    <w:p>
+      <w:pPr>
+        <w:pStyle w:val="Sinespaciado"/>
+        <w:numPr>
+          <w:ilvl w:val="2"/>
+          <w:numId w:val="2"/>
+        </w:numPr>
+        <w:jc w:val="both"/>
+        <w:rPr>
+          <w:lang w:val="es-ES_tradnl"/>
+        </w:rPr>
+      </w:pPr>
+      <w:proofErr w:type="spellStart"/>
+      <w:r>
+        <w:rPr>
+          <w:lang w:val="es-ES_tradnl"/>
+        </w:rPr>
+        <w:t>Source</w:t>
+      </w:r>
+      <w:proofErr w:type="spellEnd"/>
+      <w:r>
+        <w:rPr>
+          <w:lang w:val="es-ES_tradnl"/>
+        </w:rPr>
+        <w:t>: “</w:t>
+      </w:r>
+      <w:proofErr w:type="spellStart"/>
+      <w:r>
+        <w:rPr>
+          <w:lang w:val="es-ES_tradnl"/>
+        </w:rPr>
+        <w:t>Deploy</w:t>
+      </w:r>
+      <w:proofErr w:type="spellEnd"/>
+      <w:r>
+        <w:rPr>
+          <w:lang w:val="es-ES_tradnl"/>
+        </w:rPr>
+        <w:t xml:space="preserve"> </w:t>
+      </w:r>
+      <w:proofErr w:type="spellStart"/>
+      <w:r>
+        <w:rPr>
+          <w:lang w:val="es-ES_tradnl"/>
+        </w:rPr>
+        <w:t>from</w:t>
+      </w:r>
+      <w:proofErr w:type="spellEnd"/>
+      <w:r>
+        <w:rPr>
+          <w:lang w:val="es-ES_tradnl"/>
+        </w:rPr>
+        <w:t xml:space="preserve"> a </w:t>
+      </w:r>
+      <w:proofErr w:type="spellStart"/>
+      <w:r>
+        <w:rPr>
+          <w:lang w:val="es-ES_tradnl"/>
+        </w:rPr>
+        <w:t>branch</w:t>
+      </w:r>
+      <w:proofErr w:type="spellEnd"/>
+      <w:r>
+        <w:rPr>
+          <w:lang w:val="es-ES_tradnl"/>
+        </w:rPr>
+        <w:t>”</w:t>
+      </w:r>
+    </w:p>
+    <w:p>
+      <w:pPr>
+        <w:pStyle w:val="Sinespaciado"/>
+        <w:numPr>
+          <w:ilvl w:val="2"/>
+          <w:numId w:val="2"/>
+        </w:numPr>
+        <w:jc w:val="both"/>
+        <w:rPr>
+          <w:lang w:val="es-ES_tradnl"/>
+        </w:rPr>
+      </w:pPr>
+      <w:r>
+        <w:rPr>
+          <w:lang w:val="es-ES_tradnl"/>
+        </w:rPr>
+        <w:t xml:space="preserve">Branch: </w:t>
+      </w:r>
+      <w:proofErr w:type="spellStart"/>
+      <w:r>
+        <w:rPr>
+          <w:lang w:val="es-ES_tradnl"/>
+        </w:rPr>
+        <w:t>main</w:t>
+      </w:r>
+      <w:proofErr w:type="spellEnd"/>
+    </w:p>
+    <w:p>
+      <w:pPr>
+        <w:pStyle w:val="Sinespaciado"/>
+        <w:numPr>
+          <w:ilvl w:val="2"/>
+          <w:numId w:val="2"/>
+        </w:numPr>
+        <w:jc w:val="both"/>
+        <w:rPr>
+          <w:lang w:val="es-ES_tradnl"/>
+        </w:rPr>
+      </w:pPr>
+      <w:r>
+        <w:rPr>
+          <w:lang w:val="es-ES_tradnl"/>
+        </w:rPr>
+        <w:t>Folder: /</w:t>
+      </w:r>
+      <w:proofErr w:type="spellStart"/>
+      <w:r>
+        <w:rPr>
+          <w:lang w:val="es-ES_tradnl"/>
+        </w:rPr>
+        <w:t>docs</w:t>
+      </w:r>
+      <w:proofErr w:type="spellEnd"/>
+    </w:p>
+    <w:p>
+      <w:pPr>
+        <w:pStyle w:val="Sinespaciado"/>
+        <w:jc w:val="both"/>
+        <w:rPr>
+          <w:lang w:val="es-ES_tradnl"/>
+        </w:rPr>
+      </w:pPr>
+    </w:p>
+    <w:p>
+      <w:pPr>
+        <w:pStyle w:val="Sinespaciado"/>
+        <w:jc w:val="both"/>
+        <w:rPr>
+          <w:lang w:val="es-ES_tradnl"/>
+        </w:rPr>
+      </w:pPr>
+      <w:r>
+        <w:rPr>
+          <w:lang w:val="es-ES_tradnl"/>
+        </w:rPr>
+        <w:drawing>
+          <wp:inline distT="0" distB="0" distL="0" distR="0" wp14:anchorId="7A8DCB11" wp14:editId="2348C604">
+            <wp:extent cx="5396230" cy="2911475"/>
+            <wp:effectExtent l="0" t="0" r="1270" b="0"/>
+            <wp:docPr id="1219415559" name="Imagen 1" descr="Interfaz de usuario gráfica, Texto, Aplicación, Correo electrónico&#10;&#10;El contenido generado por IA puede ser incorrecto."/>
+            <wp:cNvGraphicFramePr>
+              <a:graphicFrameLocks xmlns:a="http://schemas.openxmlformats.org/drawingml/2006/main" noChangeAspect="1"/>
+            </wp:cNvGraphicFramePr>
+            <a:graphic xmlns:a="http://schemas.openxmlformats.org/drawingml/2006/main">
+              <a:graphicData uri="http://schemas.openxmlformats.org/drawingml/2006/picture">
+                <pic:pic xmlns:pic="http://schemas.openxmlformats.org/drawingml/2006/picture">
+                  <pic:nvPicPr>
+                    <pic:cNvPr id="1219415559" name="Imagen 1" descr="Interfaz de usuario gráfica, Texto, Aplicación, Correo electrónico&#10;&#10;El contenido generado por IA puede ser incorrecto."/>
+                    <pic:cNvPicPr/>
+                  </pic:nvPicPr>
+                  <pic:blipFill>
+                    <a:blip r:embed="rId21"/>
+                    <a:stretch>
+                      <a:fillRect/>
+                    </a:stretch>
+                  </pic:blipFill>
+                  <pic:spPr>
+                    <a:xfrm>
+                      <a:off x="0" y="0"/>
+                      <a:ext cx="5396230" cy="2911475"/>
+                    </a:xfrm>
+                    <a:prstGeom prst="rect">
+                      <a:avLst/>
+                    </a:prstGeom>
+                  </pic:spPr>
+                </pic:pic>
+              </a:graphicData>
+            </a:graphic>
+          </wp:inline>
+        </w:drawing>
+      </w:r>
+    </w:p>
+    <w:p>
+      <w:pPr>
+        <w:pStyle w:val="Sinespaciado"/>
+        <w:jc w:val="both"/>
+        <w:rPr>
+          <w:lang w:val="es-ES_tradnl"/>
+        </w:rPr>
+      </w:pPr>
+    </w:p>
+    <w:p>
+      <w:pPr>
+        <w:pStyle w:val="Sinespaciado"/>
+        <w:jc w:val="both"/>
+        <w:rPr>
+          <w:lang w:val="es-ES_tradnl"/>
+        </w:rPr>
+      </w:pPr>
+    </w:p>
+    <w:p>
+      <w:pPr>
+        <w:pStyle w:val="Sinespaciado"/>
+        <w:jc w:val="both"/>
+        <w:rPr>
+          <w:lang w:val="es-ES_tradnl"/>
+        </w:rPr>
+      </w:pPr>
+      <w:r>
+        <w:rPr>
+          <w:lang w:val="es-ES_tradnl"/>
+        </w:rPr>
+        <w:t>En unos minutos debería aparecer el contenido de nuestra página web. Si no, podemos forzar la recarga sin caché en el navegador:</w:t>
+      </w:r>
+    </w:p>
+    <w:p>
+      <w:pPr>
+        <w:pStyle w:val="Sinespaciado"/>
+        <w:numPr>
+          <w:ilvl w:val="0"/>
+          <w:numId w:val="2"/>
+        </w:numPr>
+        <w:jc w:val="both"/>
+        <w:rPr>
+          <w:lang w:val="es-ES_tradnl"/>
+        </w:rPr>
+      </w:pPr>
+      <w:r>
+        <w:rPr>
+          <w:lang w:val="es-ES_tradnl"/>
+        </w:rPr>
+        <w:t xml:space="preserve">En Mac: </w:t>
+      </w:r>
+      <w:proofErr w:type="spellStart"/>
+      <w:r>
+        <w:rPr>
+          <w:lang w:val="es-ES_tradnl"/>
+        </w:rPr>
+        <w:t>Cmd</w:t>
+      </w:r>
+      <w:proofErr w:type="spellEnd"/>
+      <w:r>
+        <w:rPr>
+          <w:lang w:val="es-ES_tradnl"/>
+        </w:rPr>
+        <w:t xml:space="preserve"> + Shift + R</w:t>
+      </w:r>
+    </w:p>
+    <w:p>
+      <w:pPr>
+        <w:pStyle w:val="Sinespaciado"/>
+        <w:jc w:val="both"/>
+        <w:rPr>
+          <w:lang w:val="es-ES_tradnl"/>
+        </w:rPr>
+      </w:pPr>
+    </w:p>
+    <w:p>
+      <w:pPr>
+        <w:pStyle w:val="Sinespaciado"/>
+        <w:jc w:val="both"/>
+        <w:rPr>
+          <w:lang w:val="es-ES_tradnl"/>
+        </w:rPr>
+      </w:pPr>
+      <w:r>
+        <w:rPr>
+          <w:lang w:val="es-ES_tradnl"/>
+        </w:rPr>
+        <w:t>Podemos ir directamente a la página web:</w:t>
+      </w:r>
+    </w:p>
+    <w:p>
+      <w:pPr>
+        <w:pStyle w:val="Sinespaciado"/>
+        <w:jc w:val="both"/>
+        <w:rPr>
+          <w:lang w:val="es-ES_tradnl"/>
+        </w:rPr>
+      </w:pPr>
+    </w:p>
+    <w:p>
+      <w:pPr>
+        <w:pStyle w:val="Sinespaciado"/>
+        <w:jc w:val="both"/>
+        <w:rPr>
+          <w:lang w:val="es-ES_tradnl"/>
+        </w:rPr>
+      </w:pPr>
+      <w:hyperlink r:id="rId22" w:history="1">
+        <w:r>
+          <w:rPr>
+            <w:rStyle w:val="Hipervnculo"/>
+            <w:lang w:val="es-ES_tradnl"/>
+          </w:rPr>
+          <w:t>https://pablo-crg.github.io/</w:t>
+        </w:r>
+      </w:hyperlink>
+    </w:p>
+    <w:p>
+      <w:pPr>
+        <w:pStyle w:val="Sinespaciado"/>
+        <w:jc w:val="both"/>
+        <w:rPr>
+          <w:lang w:val="es-ES_tradnl"/>
+        </w:rPr>
+      </w:pPr>
+    </w:p>
+    <w:p>
+      <w:pPr>
+        <w:pStyle w:val="Sinespaciado"/>
+        <w:jc w:val="both"/>
+        <w:rPr>
+          <w:lang w:val="es-ES_tradnl"/>
+        </w:rPr>
+      </w:pPr>
+    </w:p>
+    <w:p>
+      <w:pPr>
+        <w:pStyle w:val="Sinespaciado"/>
+        <w:jc w:val="both"/>
+        <w:rPr>
           <w:lang w:val="es-ES_tradnl"/>
         </w:rPr>
       </w:pPr>
@@ -1535,7 +3387,7 @@
         <w:rFonts w:ascii="Courier New" w:hAnsi="Courier New" w:cs="Courier New" w:hint="default"/>
       </w:rPr>
     </w:lvl>
-    <w:lvl w:ilvl="2" w:tplc="040A0005" w:tentative="1">
+    <w:lvl w:ilvl="2" w:tplc="040A0005">
       <w:start w:val="1"/>
       <w:numFmt w:val="bullet"/>
       <w:lvlText w:val=""/>
@@ -2400,6 +4252,29 @@
     <w:qFormat/>
     <w:rsid w:val="00737A2C"/>
   </w:style>
+  <w:style w:type="character" w:styleId="Hipervnculo">
+    <w:name w:val="Hyperlink"/>
+    <w:basedOn w:val="Fuentedeprrafopredeter"/>
+    <w:uiPriority w:val="99"/>
+    <w:unhideWhenUsed/>
+    <w:rsid w:val="00643F92"/>
+    <w:rPr>
+      <w:color w:val="0563C1" w:themeColor="hyperlink"/>
+      <w:u w:val="single"/>
+    </w:rPr>
+  </w:style>
+  <w:style w:type="character" w:styleId="Mencinsinresolver">
+    <w:name w:val="Unresolved Mention"/>
+    <w:basedOn w:val="Fuentedeprrafopredeter"/>
+    <w:uiPriority w:val="99"/>
+    <w:semiHidden/>
+    <w:unhideWhenUsed/>
+    <w:rsid w:val="00643F92"/>
+    <w:rPr>
+      <w:color w:val="605E5C"/>
+      <w:shd w:val="clear" w:color="auto" w:fill="E1DFDD"/>
+    </w:rPr>
+  </w:style>
 </w:styles>
 </file>
 

</xml_diff>